<commit_message>
improved certificate generation by adding a setting for church address.
</commit_message>
<xml_diff>
--- a/src/SacramentalRecords.App/assets/template.docx
+++ b/src/SacramentalRecords.App/assets/template.docx
@@ -2124,7 +2124,7 @@
           <w:noProof/>
           <w:sz w:val="24"/>
         </w:rPr>
-        <w:t>October 13, 2026</w:t>
+        <w:t>October 17, 2026</w:t>
       </w:r>
       <w:r>
         <w:rPr>
@@ -2610,7 +2610,6 @@
       <w:pPr>
         <w:tabs>
           <w:tab w:val="left" w:pos="1530"/>
-          <w:tab w:val="left" w:pos="8280"/>
         </w:tabs>
         <w:spacing w:line="240" w:lineRule="auto"/>
         <w:ind w:left="720"/>
@@ -2623,48 +2622,61 @@
       </w:pPr>
       <w:r>
         <w:rPr>
-          <w:sz w:val="16"/>
-          <w:szCs w:val="16"/>
-        </w:rPr>
-        <w:t>St. Joseph Church</w:t>
-      </w:r>
-    </w:p>
-    <w:p>
-      <w:pPr>
-        <w:tabs>
-          <w:tab w:val="left" w:pos="1530"/>
-        </w:tabs>
-        <w:spacing w:line="240" w:lineRule="auto"/>
-        <w:ind w:left="720"/>
-        <w:divId w:val="451289609"/>
-        <w:rPr>
           <w:rFonts w:ascii="Garamond" w:hAnsi="Garamond"/>
           <w:sz w:val="16"/>
           <w:szCs w:val="16"/>
         </w:rPr>
-      </w:pPr>
-      <w:r>
-        <w:rPr>
+        <w:fldChar w:fldCharType="begin"/>
+      </w:r>
+      <w:r>
+        <w:rPr>
+          <w:rFonts w:ascii="Garamond" w:hAnsi="Garamond"/>
           <w:sz w:val="16"/>
           <w:szCs w:val="16"/>
         </w:rPr>
-        <w:t xml:space="preserve">1029 </w:t>
-      </w:r>
-      <w:proofErr w:type="spellStart"/>
-      <w:r>
-        <w:rPr>
+        <w:instrText xml:space="preserve"> DOCPROPERTY  Cert.ChurchAddress  \* MERGEFORMAT </w:instrText>
+      </w:r>
+      <w:r>
+        <w:rPr>
+          <w:rFonts w:ascii="Garamond" w:hAnsi="Garamond"/>
           <w:sz w:val="16"/>
           <w:szCs w:val="16"/>
         </w:rPr>
-        <w:t>Kundek</w:t>
-      </w:r>
-      <w:proofErr w:type="spellEnd"/>
-      <w:r>
-        <w:rPr>
+        <w:fldChar w:fldCharType="separate"/>
+      </w:r>
+      <w:r>
+        <w:rPr>
+          <w:rFonts w:ascii="Garamond" w:hAnsi="Garamond"/>
           <w:sz w:val="16"/>
           <w:szCs w:val="16"/>
         </w:rPr>
-        <w:t xml:space="preserve"> St Jasper, IN 47546-1918</w:t>
+        <w:t>[</w:t>
+      </w:r>
+      <w:proofErr w:type="spellStart"/>
+      <w:r>
+        <w:rPr>
+          <w:rFonts w:ascii="Garamond" w:hAnsi="Garamond"/>
+          <w:sz w:val="16"/>
+          <w:szCs w:val="16"/>
+        </w:rPr>
+        <w:t>Cert.ChurchAddress</w:t>
+      </w:r>
+      <w:proofErr w:type="spellEnd"/>
+      <w:r>
+        <w:rPr>
+          <w:rFonts w:ascii="Garamond" w:hAnsi="Garamond"/>
+          <w:sz w:val="16"/>
+          <w:szCs w:val="16"/>
+        </w:rPr>
+        <w:t>]</w:t>
+      </w:r>
+      <w:r>
+        <w:rPr>
+          <w:rFonts w:ascii="Garamond" w:hAnsi="Garamond"/>
+          <w:sz w:val="16"/>
+          <w:szCs w:val="16"/>
+        </w:rPr>
+        <w:fldChar w:fldCharType="end"/>
       </w:r>
     </w:p>
     <w:p>
@@ -5037,6 +5049,7 @@
       </w:r>
       <w:r>
         <w:rPr>
+          <w:noProof/>
           <w:sz w:val="22"/>
           <w:szCs w:val="32"/>
         </w:rPr>

</xml_diff>